<commit_message>
new dsp lab doc files added
</commit_message>
<xml_diff>
--- a/06 Sixth Semester/CSE 3208 Digital Signal Processing Lab/Docs/Digital Signal Lab Index rolls.docx
+++ b/06 Sixth Semester/CSE 3208 Digital Signal Processing Lab/Docs/Digital Signal Lab Index rolls.docx
@@ -1114,7 +1114,7 @@
           </w:tblBorders>
         </w:tblPrEx>
         <w:trPr>
-          <w:trHeight w:val="935"/>
+          <w:trHeight w:val="746"/>
         </w:trPr>
         <w:tc>
           <w:tcPr>
@@ -1146,7 +1146,7 @@
                 <w:sz w:val="28"/>
                 <w:szCs w:val="28"/>
               </w:rPr>
-              <w:t>2</w:t>
+              <w:t>1</w:t>
             </w:r>
           </w:p>
         </w:tc>
@@ -1164,6 +1164,14 @@
                 <w:szCs w:val="28"/>
               </w:rPr>
             </w:pPr>
+            <w:r>
+              <w:rPr>
+                <w:rFonts w:ascii="Times New Roman" w:hAnsi="Times New Roman" w:cs="Times New Roman"/>
+                <w:sz w:val="28"/>
+                <w:szCs w:val="28"/>
+              </w:rPr>
+              <w:t>To Develop Sine and Cosine function waveforms.</w:t>
+            </w:r>
           </w:p>
         </w:tc>
         <w:tc>
@@ -1256,7 +1264,7 @@
                 <w:sz w:val="28"/>
                 <w:szCs w:val="28"/>
               </w:rPr>
-              <w:t>3</w:t>
+              <w:t>2</w:t>
             </w:r>
           </w:p>
         </w:tc>
@@ -1358,7 +1366,15 @@
                 <w:sz w:val="28"/>
                 <w:szCs w:val="28"/>
               </w:rPr>
-              <w:t>04</w:t>
+              <w:t>0</w:t>
+            </w:r>
+            <w:r>
+              <w:rPr>
+                <w:rFonts w:ascii="Times New Roman" w:hAnsi="Times New Roman" w:cs="Times New Roman"/>
+                <w:sz w:val="28"/>
+                <w:szCs w:val="28"/>
+              </w:rPr>
+              <w:t>3</w:t>
             </w:r>
           </w:p>
         </w:tc>
@@ -1460,7 +1476,15 @@
                 <w:sz w:val="28"/>
                 <w:szCs w:val="28"/>
               </w:rPr>
-              <w:t>05</w:t>
+              <w:t>0</w:t>
+            </w:r>
+            <w:r>
+              <w:rPr>
+                <w:rFonts w:ascii="Times New Roman" w:hAnsi="Times New Roman" w:cs="Times New Roman"/>
+                <w:sz w:val="28"/>
+                <w:szCs w:val="28"/>
+              </w:rPr>
+              <w:t>4</w:t>
             </w:r>
           </w:p>
         </w:tc>
@@ -1562,7 +1586,15 @@
                 <w:sz w:val="28"/>
                 <w:szCs w:val="28"/>
               </w:rPr>
-              <w:t>06</w:t>
+              <w:t>0</w:t>
+            </w:r>
+            <w:r>
+              <w:rPr>
+                <w:rFonts w:ascii="Times New Roman" w:hAnsi="Times New Roman" w:cs="Times New Roman"/>
+                <w:sz w:val="28"/>
+                <w:szCs w:val="28"/>
+              </w:rPr>
+              <w:t>5</w:t>
             </w:r>
           </w:p>
         </w:tc>
@@ -1664,7 +1696,15 @@
                 <w:sz w:val="28"/>
                 <w:szCs w:val="28"/>
               </w:rPr>
-              <w:t>07</w:t>
+              <w:t>0</w:t>
+            </w:r>
+            <w:r>
+              <w:rPr>
+                <w:rFonts w:ascii="Times New Roman" w:hAnsi="Times New Roman" w:cs="Times New Roman"/>
+                <w:sz w:val="28"/>
+                <w:szCs w:val="28"/>
+              </w:rPr>
+              <w:t>6</w:t>
             </w:r>
           </w:p>
         </w:tc>
@@ -1766,7 +1806,15 @@
                 <w:sz w:val="28"/>
                 <w:szCs w:val="28"/>
               </w:rPr>
-              <w:t>08</w:t>
+              <w:t>0</w:t>
+            </w:r>
+            <w:r>
+              <w:rPr>
+                <w:rFonts w:ascii="Times New Roman" w:hAnsi="Times New Roman" w:cs="Times New Roman"/>
+                <w:sz w:val="28"/>
+                <w:szCs w:val="28"/>
+              </w:rPr>
+              <w:t>7</w:t>
             </w:r>
           </w:p>
         </w:tc>
@@ -2927,7 +2975,7 @@
           </w:tblBorders>
         </w:tblPrEx>
         <w:trPr>
-          <w:trHeight w:val="935"/>
+          <w:trHeight w:val="746"/>
         </w:trPr>
         <w:tc>
           <w:tcPr>
@@ -2951,7 +2999,7 @@
                 <w:sz w:val="28"/>
                 <w:szCs w:val="28"/>
               </w:rPr>
-              <w:t>02</w:t>
+              <w:t>01</w:t>
             </w:r>
           </w:p>
         </w:tc>
@@ -2969,6 +3017,14 @@
                 <w:szCs w:val="28"/>
               </w:rPr>
             </w:pPr>
+            <w:r>
+              <w:rPr>
+                <w:rFonts w:ascii="Times New Roman" w:hAnsi="Times New Roman" w:cs="Times New Roman"/>
+                <w:sz w:val="28"/>
+                <w:szCs w:val="28"/>
+              </w:rPr>
+              <w:t>To Develop Sine and Cosine function waveforms.</w:t>
+            </w:r>
           </w:p>
         </w:tc>
         <w:tc>
@@ -3053,7 +3109,7 @@
                 <w:sz w:val="28"/>
                 <w:szCs w:val="28"/>
               </w:rPr>
-              <w:t>03</w:t>
+              <w:t>02</w:t>
             </w:r>
           </w:p>
         </w:tc>
@@ -3155,7 +3211,7 @@
                 <w:sz w:val="28"/>
                 <w:szCs w:val="28"/>
               </w:rPr>
-              <w:t>04</w:t>
+              <w:t>03</w:t>
             </w:r>
           </w:p>
         </w:tc>
@@ -3257,7 +3313,7 @@
                 <w:sz w:val="28"/>
                 <w:szCs w:val="28"/>
               </w:rPr>
-              <w:t>05</w:t>
+              <w:t>04</w:t>
             </w:r>
           </w:p>
         </w:tc>
@@ -3359,7 +3415,7 @@
                 <w:sz w:val="28"/>
                 <w:szCs w:val="28"/>
               </w:rPr>
-              <w:t>06</w:t>
+              <w:t>05</w:t>
             </w:r>
           </w:p>
         </w:tc>
@@ -3461,7 +3517,7 @@
                 <w:sz w:val="28"/>
                 <w:szCs w:val="28"/>
               </w:rPr>
-              <w:t>07</w:t>
+              <w:t>06</w:t>
             </w:r>
           </w:p>
         </w:tc>
@@ -3563,7 +3619,7 @@
                 <w:sz w:val="28"/>
                 <w:szCs w:val="28"/>
               </w:rPr>
-              <w:t>08</w:t>
+              <w:t>07</w:t>
             </w:r>
           </w:p>
         </w:tc>
@@ -4083,15 +4139,7 @@
                 <w:sz w:val="32"/>
                 <w:szCs w:val="32"/>
               </w:rPr>
-              <w:t>241311</w:t>
-            </w:r>
-            <w:r>
-              <w:rPr>
-                <w:rFonts w:ascii="Times New Roman" w:hAnsi="Times New Roman" w:cs="Times New Roman"/>
-                <w:sz w:val="32"/>
-                <w:szCs w:val="32"/>
-              </w:rPr>
-              <w:t>053</w:t>
+              <w:t>241311053</w:t>
             </w:r>
           </w:p>
         </w:tc>
@@ -4724,7 +4772,7 @@
           </w:tblBorders>
         </w:tblPrEx>
         <w:trPr>
-          <w:trHeight w:val="935"/>
+          <w:trHeight w:val="746"/>
         </w:trPr>
         <w:tc>
           <w:tcPr>
@@ -4748,7 +4796,7 @@
                 <w:sz w:val="28"/>
                 <w:szCs w:val="28"/>
               </w:rPr>
-              <w:t>02</w:t>
+              <w:t>01</w:t>
             </w:r>
           </w:p>
         </w:tc>
@@ -4766,6 +4814,14 @@
                 <w:szCs w:val="28"/>
               </w:rPr>
             </w:pPr>
+            <w:r>
+              <w:rPr>
+                <w:rFonts w:ascii="Times New Roman" w:hAnsi="Times New Roman" w:cs="Times New Roman"/>
+                <w:sz w:val="28"/>
+                <w:szCs w:val="28"/>
+              </w:rPr>
+              <w:t>To Develop Sine and Cosine function waveforms.</w:t>
+            </w:r>
           </w:p>
         </w:tc>
         <w:tc>
@@ -4850,7 +4906,7 @@
                 <w:sz w:val="28"/>
                 <w:szCs w:val="28"/>
               </w:rPr>
-              <w:t>03</w:t>
+              <w:t>02</w:t>
             </w:r>
           </w:p>
         </w:tc>
@@ -4952,7 +5008,7 @@
                 <w:sz w:val="28"/>
                 <w:szCs w:val="28"/>
               </w:rPr>
-              <w:t>04</w:t>
+              <w:t>03</w:t>
             </w:r>
           </w:p>
         </w:tc>
@@ -5054,7 +5110,7 @@
                 <w:sz w:val="28"/>
                 <w:szCs w:val="28"/>
               </w:rPr>
-              <w:t>05</w:t>
+              <w:t>04</w:t>
             </w:r>
           </w:p>
         </w:tc>
@@ -5156,7 +5212,7 @@
                 <w:sz w:val="28"/>
                 <w:szCs w:val="28"/>
               </w:rPr>
-              <w:t>06</w:t>
+              <w:t>05</w:t>
             </w:r>
           </w:p>
         </w:tc>
@@ -5258,7 +5314,7 @@
                 <w:sz w:val="28"/>
                 <w:szCs w:val="28"/>
               </w:rPr>
-              <w:t>07</w:t>
+              <w:t>06</w:t>
             </w:r>
           </w:p>
         </w:tc>
@@ -5360,7 +5416,7 @@
                 <w:sz w:val="28"/>
                 <w:szCs w:val="28"/>
               </w:rPr>
-              <w:t>08</w:t>
+              <w:t>07</w:t>
             </w:r>
           </w:p>
         </w:tc>
@@ -6521,7 +6577,7 @@
           </w:tblBorders>
         </w:tblPrEx>
         <w:trPr>
-          <w:trHeight w:val="935"/>
+          <w:trHeight w:val="746"/>
         </w:trPr>
         <w:tc>
           <w:tcPr>
@@ -6545,7 +6601,7 @@
                 <w:sz w:val="28"/>
                 <w:szCs w:val="28"/>
               </w:rPr>
-              <w:t>02</w:t>
+              <w:t>01</w:t>
             </w:r>
           </w:p>
         </w:tc>
@@ -6563,6 +6619,14 @@
                 <w:szCs w:val="28"/>
               </w:rPr>
             </w:pPr>
+            <w:r>
+              <w:rPr>
+                <w:rFonts w:ascii="Times New Roman" w:hAnsi="Times New Roman" w:cs="Times New Roman"/>
+                <w:sz w:val="28"/>
+                <w:szCs w:val="28"/>
+              </w:rPr>
+              <w:t>To Develop Sine and Cosine function waveforms.</w:t>
+            </w:r>
           </w:p>
         </w:tc>
         <w:tc>
@@ -6647,7 +6711,7 @@
                 <w:sz w:val="28"/>
                 <w:szCs w:val="28"/>
               </w:rPr>
-              <w:t>03</w:t>
+              <w:t>02</w:t>
             </w:r>
           </w:p>
         </w:tc>
@@ -6749,7 +6813,7 @@
                 <w:sz w:val="28"/>
                 <w:szCs w:val="28"/>
               </w:rPr>
-              <w:t>04</w:t>
+              <w:t>03</w:t>
             </w:r>
           </w:p>
         </w:tc>
@@ -6851,7 +6915,7 @@
                 <w:sz w:val="28"/>
                 <w:szCs w:val="28"/>
               </w:rPr>
-              <w:t>05</w:t>
+              <w:t>04</w:t>
             </w:r>
           </w:p>
         </w:tc>
@@ -6953,7 +7017,7 @@
                 <w:sz w:val="28"/>
                 <w:szCs w:val="28"/>
               </w:rPr>
-              <w:t>06</w:t>
+              <w:t>05</w:t>
             </w:r>
           </w:p>
         </w:tc>
@@ -7055,7 +7119,7 @@
                 <w:sz w:val="28"/>
                 <w:szCs w:val="28"/>
               </w:rPr>
-              <w:t>07</w:t>
+              <w:t>06</w:t>
             </w:r>
           </w:p>
         </w:tc>
@@ -7157,7 +7221,7 @@
                 <w:sz w:val="28"/>
                 <w:szCs w:val="28"/>
               </w:rPr>
-              <w:t>08</w:t>
+              <w:t>07</w:t>
             </w:r>
           </w:p>
         </w:tc>
@@ -8289,7 +8353,7 @@
           </w:tblBorders>
         </w:tblPrEx>
         <w:trPr>
-          <w:trHeight w:val="935"/>
+          <w:trHeight w:val="746"/>
         </w:trPr>
         <w:tc>
           <w:tcPr>
@@ -8313,7 +8377,7 @@
                 <w:sz w:val="28"/>
                 <w:szCs w:val="28"/>
               </w:rPr>
-              <w:t>02</w:t>
+              <w:t>01</w:t>
             </w:r>
           </w:p>
         </w:tc>
@@ -8331,6 +8395,14 @@
                 <w:szCs w:val="28"/>
               </w:rPr>
             </w:pPr>
+            <w:r>
+              <w:rPr>
+                <w:rFonts w:ascii="Times New Roman" w:hAnsi="Times New Roman" w:cs="Times New Roman"/>
+                <w:sz w:val="28"/>
+                <w:szCs w:val="28"/>
+              </w:rPr>
+              <w:t>To Develop Sine and Cosine function waveforms.</w:t>
+            </w:r>
           </w:p>
         </w:tc>
         <w:tc>
@@ -8415,7 +8487,7 @@
                 <w:sz w:val="28"/>
                 <w:szCs w:val="28"/>
               </w:rPr>
-              <w:t>03</w:t>
+              <w:t>02</w:t>
             </w:r>
           </w:p>
         </w:tc>
@@ -8517,7 +8589,7 @@
                 <w:sz w:val="28"/>
                 <w:szCs w:val="28"/>
               </w:rPr>
-              <w:t>04</w:t>
+              <w:t>03</w:t>
             </w:r>
           </w:p>
         </w:tc>
@@ -8619,7 +8691,7 @@
                 <w:sz w:val="28"/>
                 <w:szCs w:val="28"/>
               </w:rPr>
-              <w:t>05</w:t>
+              <w:t>04</w:t>
             </w:r>
           </w:p>
         </w:tc>
@@ -8721,7 +8793,7 @@
                 <w:sz w:val="28"/>
                 <w:szCs w:val="28"/>
               </w:rPr>
-              <w:t>06</w:t>
+              <w:t>05</w:t>
             </w:r>
           </w:p>
         </w:tc>
@@ -8823,7 +8895,7 @@
                 <w:sz w:val="28"/>
                 <w:szCs w:val="28"/>
               </w:rPr>
-              <w:t>07</w:t>
+              <w:t>06</w:t>
             </w:r>
           </w:p>
         </w:tc>
@@ -8925,7 +8997,7 @@
                 <w:sz w:val="28"/>
                 <w:szCs w:val="28"/>
               </w:rPr>
-              <w:t>08</w:t>
+              <w:t>07</w:t>
             </w:r>
           </w:p>
         </w:tc>
@@ -10057,7 +10129,7 @@
           </w:tblBorders>
         </w:tblPrEx>
         <w:trPr>
-          <w:trHeight w:val="935"/>
+          <w:trHeight w:val="746"/>
         </w:trPr>
         <w:tc>
           <w:tcPr>
@@ -10081,7 +10153,7 @@
                 <w:sz w:val="28"/>
                 <w:szCs w:val="28"/>
               </w:rPr>
-              <w:t>02</w:t>
+              <w:t>01</w:t>
             </w:r>
           </w:p>
         </w:tc>
@@ -10099,6 +10171,14 @@
                 <w:szCs w:val="28"/>
               </w:rPr>
             </w:pPr>
+            <w:r>
+              <w:rPr>
+                <w:rFonts w:ascii="Times New Roman" w:hAnsi="Times New Roman" w:cs="Times New Roman"/>
+                <w:sz w:val="28"/>
+                <w:szCs w:val="28"/>
+              </w:rPr>
+              <w:t>To Develop Sine and Cosine function waveforms.</w:t>
+            </w:r>
           </w:p>
         </w:tc>
         <w:tc>
@@ -10183,7 +10263,7 @@
                 <w:sz w:val="28"/>
                 <w:szCs w:val="28"/>
               </w:rPr>
-              <w:t>03</w:t>
+              <w:t>02</w:t>
             </w:r>
           </w:p>
         </w:tc>
@@ -10285,7 +10365,7 @@
                 <w:sz w:val="28"/>
                 <w:szCs w:val="28"/>
               </w:rPr>
-              <w:t>04</w:t>
+              <w:t>03</w:t>
             </w:r>
           </w:p>
         </w:tc>
@@ -10387,7 +10467,7 @@
                 <w:sz w:val="28"/>
                 <w:szCs w:val="28"/>
               </w:rPr>
-              <w:t>05</w:t>
+              <w:t>04</w:t>
             </w:r>
           </w:p>
         </w:tc>
@@ -10489,7 +10569,7 @@
                 <w:sz w:val="28"/>
                 <w:szCs w:val="28"/>
               </w:rPr>
-              <w:t>06</w:t>
+              <w:t>05</w:t>
             </w:r>
           </w:p>
         </w:tc>
@@ -10591,7 +10671,7 @@
                 <w:sz w:val="28"/>
                 <w:szCs w:val="28"/>
               </w:rPr>
-              <w:t>07</w:t>
+              <w:t>06</w:t>
             </w:r>
           </w:p>
         </w:tc>
@@ -10693,7 +10773,7 @@
                 <w:sz w:val="28"/>
                 <w:szCs w:val="28"/>
               </w:rPr>
-              <w:t>08</w:t>
+              <w:t>07</w:t>
             </w:r>
           </w:p>
         </w:tc>
@@ -11854,7 +11934,7 @@
           </w:tblBorders>
         </w:tblPrEx>
         <w:trPr>
-          <w:trHeight w:val="935"/>
+          <w:trHeight w:val="746"/>
         </w:trPr>
         <w:tc>
           <w:tcPr>
@@ -11878,7 +11958,7 @@
                 <w:sz w:val="28"/>
                 <w:szCs w:val="28"/>
               </w:rPr>
-              <w:t>02</w:t>
+              <w:t>01</w:t>
             </w:r>
           </w:p>
         </w:tc>
@@ -11896,6 +11976,14 @@
                 <w:szCs w:val="28"/>
               </w:rPr>
             </w:pPr>
+            <w:r>
+              <w:rPr>
+                <w:rFonts w:ascii="Times New Roman" w:hAnsi="Times New Roman" w:cs="Times New Roman"/>
+                <w:sz w:val="28"/>
+                <w:szCs w:val="28"/>
+              </w:rPr>
+              <w:t>To Develop Sine and Cosine function waveforms.</w:t>
+            </w:r>
           </w:p>
         </w:tc>
         <w:tc>
@@ -11980,7 +12068,7 @@
                 <w:sz w:val="28"/>
                 <w:szCs w:val="28"/>
               </w:rPr>
-              <w:t>03</w:t>
+              <w:t>02</w:t>
             </w:r>
           </w:p>
         </w:tc>
@@ -12082,7 +12170,7 @@
                 <w:sz w:val="28"/>
                 <w:szCs w:val="28"/>
               </w:rPr>
-              <w:t>04</w:t>
+              <w:t>03</w:t>
             </w:r>
           </w:p>
         </w:tc>
@@ -12184,7 +12272,7 @@
                 <w:sz w:val="28"/>
                 <w:szCs w:val="28"/>
               </w:rPr>
-              <w:t>05</w:t>
+              <w:t>04</w:t>
             </w:r>
           </w:p>
         </w:tc>
@@ -12286,7 +12374,7 @@
                 <w:sz w:val="28"/>
                 <w:szCs w:val="28"/>
               </w:rPr>
-              <w:t>06</w:t>
+              <w:t>05</w:t>
             </w:r>
           </w:p>
         </w:tc>
@@ -12388,7 +12476,7 @@
                 <w:sz w:val="28"/>
                 <w:szCs w:val="28"/>
               </w:rPr>
-              <w:t>07</w:t>
+              <w:t>06</w:t>
             </w:r>
           </w:p>
         </w:tc>
@@ -12490,7 +12578,7 @@
                 <w:sz w:val="28"/>
                 <w:szCs w:val="28"/>
               </w:rPr>
-              <w:t>08</w:t>
+              <w:t>07</w:t>
             </w:r>
           </w:p>
         </w:tc>
@@ -13652,7 +13740,7 @@
           </w:tblBorders>
         </w:tblPrEx>
         <w:trPr>
-          <w:trHeight w:val="935"/>
+          <w:trHeight w:val="746"/>
         </w:trPr>
         <w:tc>
           <w:tcPr>
@@ -13676,7 +13764,7 @@
                 <w:sz w:val="28"/>
                 <w:szCs w:val="28"/>
               </w:rPr>
-              <w:t>02</w:t>
+              <w:t>01</w:t>
             </w:r>
           </w:p>
         </w:tc>
@@ -13694,6 +13782,14 @@
                 <w:szCs w:val="28"/>
               </w:rPr>
             </w:pPr>
+            <w:r>
+              <w:rPr>
+                <w:rFonts w:ascii="Times New Roman" w:hAnsi="Times New Roman" w:cs="Times New Roman"/>
+                <w:sz w:val="28"/>
+                <w:szCs w:val="28"/>
+              </w:rPr>
+              <w:t>To Develop Sine and Cosine function waveforms.</w:t>
+            </w:r>
           </w:p>
         </w:tc>
         <w:tc>
@@ -13778,7 +13874,7 @@
                 <w:sz w:val="28"/>
                 <w:szCs w:val="28"/>
               </w:rPr>
-              <w:t>03</w:t>
+              <w:t>02</w:t>
             </w:r>
           </w:p>
         </w:tc>
@@ -13880,7 +13976,7 @@
                 <w:sz w:val="28"/>
                 <w:szCs w:val="28"/>
               </w:rPr>
-              <w:t>04</w:t>
+              <w:t>03</w:t>
             </w:r>
           </w:p>
         </w:tc>
@@ -13982,7 +14078,7 @@
                 <w:sz w:val="28"/>
                 <w:szCs w:val="28"/>
               </w:rPr>
-              <w:t>05</w:t>
+              <w:t>04</w:t>
             </w:r>
           </w:p>
         </w:tc>
@@ -14084,7 +14180,7 @@
                 <w:sz w:val="28"/>
                 <w:szCs w:val="28"/>
               </w:rPr>
-              <w:t>06</w:t>
+              <w:t>05</w:t>
             </w:r>
           </w:p>
         </w:tc>
@@ -14186,7 +14282,7 @@
                 <w:sz w:val="28"/>
                 <w:szCs w:val="28"/>
               </w:rPr>
-              <w:t>07</w:t>
+              <w:t>06</w:t>
             </w:r>
           </w:p>
         </w:tc>
@@ -14288,7 +14384,7 @@
                 <w:sz w:val="28"/>
                 <w:szCs w:val="28"/>
               </w:rPr>
-              <w:t>08</w:t>
+              <w:t>07</w:t>
             </w:r>
           </w:p>
         </w:tc>
@@ -14770,6 +14866,7 @@
   <w:style w:type="character" w:default="1" w:styleId="DefaultParagraphFont">
     <w:name w:val="Default Paragraph Font"/>
     <w:uiPriority w:val="1"/>
+    <w:semiHidden/>
     <w:unhideWhenUsed/>
   </w:style>
   <w:style w:type="table" w:default="1" w:styleId="TableNormal">

</xml_diff>